<commit_message>
updated files in 2022/Revision Batch/V2022.1.000
•	2022-CF1R-ENV-04-E-CoolRoofAndSRIWorksheet
•	2022-CF2R-SRA-02-E-MinimumSolarZoneAreaWorksheet
•	2022-CF2R-SRA-01-E-SolarReadiness-NewConstruction
•	2022-CF2R-PLB-22-H-SingleDwellingUnitHotWaterSystemDistribution
•	2022-CF2R-MCH-29-H-SupplyDuctSurfaceAreaBuriedDucts
•	2022-CF2R-ENV-04-E-Roofing-RadiantBarrier
•	2022-CF3R-PLB-22-HERS-SingleDwellingUnitHotWaterSystemDistribution
•	2022-CF3R-MCH-29-SupplyDuctSurfaceAreaBuriedDucts
•	2022-LMCI-PLB-22-H-IndividualDwellingUnitHotWaterSystemDistribution
•	2022-LMCI-MCH-29-H-SupplyDuctSurfaceAreaBuriedDucts
•	2022-LMCV-MCH-29-SupplyDuctSurfaceAreaBuriedDucts
</commit_message>
<xml_diff>
--- a/2022/Revision Batch/V2022.1.000/CF1R/2022-CF1R-ENV-04-E-CoolRoofAndSRIWorksheet.docx
+++ b/2022/Revision Batch/V2022.1.000/CF1R/2022-CF1R-ENV-04-E-CoolRoofAndSRIWorksheet.docx
@@ -1560,25 +1560,7 @@
                 <w:sz w:val="20"/>
                 <w:szCs w:val="20"/>
               </w:rPr>
-              <w:t xml:space="preserve">I understand that a registered copy of this Certificate of Compliance shall be made available with the building permit(s) issued for the </w:t>
-            </w:r>
-            <w:proofErr w:type="gramStart"/>
-            <w:r>
-              <w:rPr>
-                <w:rFonts w:asciiTheme="minorHAnsi" w:eastAsia="Times New Roman" w:hAnsiTheme="minorHAnsi" w:cstheme="minorHAnsi"/>
-                <w:sz w:val="20"/>
-                <w:szCs w:val="20"/>
-              </w:rPr>
-              <w:t>building, and</w:t>
-            </w:r>
-            <w:proofErr w:type="gramEnd"/>
-            <w:r>
-              <w:rPr>
-                <w:rFonts w:asciiTheme="minorHAnsi" w:eastAsia="Times New Roman" w:hAnsiTheme="minorHAnsi" w:cstheme="minorHAnsi"/>
-                <w:sz w:val="20"/>
-                <w:szCs w:val="20"/>
-              </w:rPr>
-              <w:t xml:space="preserve"> made available to the enforcement agency for all applicable inspections, and I will take the necessary steps to accomplish this requirement. </w:t>
+              <w:t xml:space="preserve">I understand that a registered copy of this Certificate of Compliance shall be made available with the building permit(s) issued for the building, and made available to the enforcement agency for all applicable inspections, and I will take the necessary steps to accomplish this requirement. </w:t>
             </w:r>
           </w:p>
           <w:p>
@@ -2524,7 +2506,6 @@
         </w:rPr>
         <w:t>1-</w:t>
       </w:r>
-      <w:proofErr w:type="gramStart"/>
       <w:r>
         <w:rPr>
           <w:sz w:val="20"/>
@@ -2544,15 +2525,7 @@
           <w:sz w:val="20"/>
           <w:szCs w:val="20"/>
         </w:rPr>
-        <w:t>Tag</w:t>
-      </w:r>
-      <w:proofErr w:type="gramEnd"/>
-      <w:r>
-        <w:rPr>
-          <w:sz w:val="20"/>
-          <w:szCs w:val="20"/>
-        </w:rPr>
-        <w:t xml:space="preserve">/ID, </w:t>
+        <w:t xml:space="preserve">Tag/ID, </w:t>
       </w:r>
       <w:r>
         <w:rPr>
@@ -2603,16 +2576,92 @@
         </w:rPr>
         <w:t xml:space="preserve"> the Cool Roof Rating Council’s website. The product directory is located at </w:t>
       </w:r>
-      <w:hyperlink r:id="rId16" w:history="1">
+      <w:ins w:id="0" w:author="Alhabibi, Haider@Energy" w:date="2022-12-28T12:57:00Z">
+        <w:r>
+          <w:rPr>
+            <w:sz w:val="20"/>
+            <w:szCs w:val="20"/>
+          </w:rPr>
+          <w:fldChar w:fldCharType="begin"/>
+        </w:r>
+        <w:r>
+          <w:rPr>
+            <w:sz w:val="20"/>
+            <w:szCs w:val="20"/>
+          </w:rPr>
+          <w:instrText xml:space="preserve"> HYPERLINK "</w:instrText>
+        </w:r>
+        <w:r>
+          <w:rPr>
+            <w:sz w:val="20"/>
+            <w:szCs w:val="20"/>
+          </w:rPr>
+          <w:instrText>https://coolroofs.org/directory/roof</w:instrText>
+        </w:r>
+        <w:r>
+          <w:rPr>
+            <w:sz w:val="20"/>
+            <w:szCs w:val="20"/>
+          </w:rPr>
+          <w:instrText xml:space="preserve">" </w:instrText>
+        </w:r>
+        <w:r>
+          <w:rPr>
+            <w:sz w:val="20"/>
+            <w:szCs w:val="20"/>
+          </w:rPr>
+          <w:fldChar w:fldCharType="separate"/>
+        </w:r>
         <w:r>
           <w:rPr>
             <w:rStyle w:val="Hyperlink"/>
             <w:sz w:val="20"/>
             <w:szCs w:val="20"/>
           </w:rPr>
-          <w:t>http://www.coolroofs.org/products/search.php</w:t>
+          <w:t>https://coolroofs.org/directory/roof</w:t>
         </w:r>
-      </w:hyperlink>
+        <w:r>
+          <w:rPr>
+            <w:sz w:val="20"/>
+            <w:szCs w:val="20"/>
+          </w:rPr>
+          <w:fldChar w:fldCharType="end"/>
+        </w:r>
+        <w:r>
+          <w:rPr>
+            <w:sz w:val="20"/>
+            <w:szCs w:val="20"/>
+          </w:rPr>
+          <w:t xml:space="preserve"> </w:t>
+        </w:r>
+      </w:ins>
+      <w:del w:id="1" w:author="Alhabibi, Haider@Energy" w:date="2022-12-28T12:57:00Z">
+        <w:r>
+          <w:fldChar w:fldCharType="begin"/>
+        </w:r>
+        <w:r>
+          <w:delInstrText>HYPERLINK "http://www.coolroofs.org/products/search.php"</w:delInstrText>
+        </w:r>
+        <w:r>
+          <w:fldChar w:fldCharType="separate"/>
+        </w:r>
+        <w:r>
+          <w:rPr>
+            <w:rStyle w:val="Hyperlink"/>
+            <w:sz w:val="20"/>
+            <w:szCs w:val="20"/>
+          </w:rPr>
+          <w:delText>http://www.coolroofs.org/products/search.php</w:delText>
+        </w:r>
+        <w:r>
+          <w:rPr>
+            <w:rStyle w:val="Hyperlink"/>
+            <w:sz w:val="20"/>
+            <w:szCs w:val="20"/>
+          </w:rPr>
+          <w:fldChar w:fldCharType="end"/>
+        </w:r>
+      </w:del>
       <w:r>
         <w:rPr>
           <w:sz w:val="20"/>
@@ -2691,17 +2740,8 @@
           <w:sz w:val="20"/>
           <w:szCs w:val="20"/>
         </w:rPr>
-        <w:t xml:space="preserve">esignate the roof slope as either “less than </w:t>
-      </w:r>
-      <w:proofErr w:type="gramStart"/>
-      <w:r>
-        <w:rPr>
-          <w:sz w:val="20"/>
-          <w:szCs w:val="20"/>
-        </w:rPr>
-        <w:t>2:12”(</w:t>
-      </w:r>
-      <w:proofErr w:type="gramEnd"/>
+        <w:t>esignate the roof slope as either “less than 2:12”(</w:t>
+      </w:r>
       <w:r>
         <w:rPr>
           <w:sz w:val="20"/>
@@ -3635,10 +3675,10 @@
           <w:tab w:val="left" w:pos="3769"/>
         </w:tabs>
         <w:sectPr>
-          <w:headerReference w:type="even" r:id="rId17"/>
-          <w:headerReference w:type="default" r:id="rId18"/>
-          <w:footerReference w:type="default" r:id="rId19"/>
-          <w:headerReference w:type="first" r:id="rId20"/>
+          <w:headerReference w:type="even" r:id="rId16"/>
+          <w:headerReference w:type="default" r:id="rId17"/>
+          <w:footerReference w:type="default" r:id="rId18"/>
+          <w:headerReference w:type="first" r:id="rId19"/>
           <w:pgSz w:w="12240" w:h="15840"/>
           <w:pgMar w:top="720" w:right="720" w:bottom="720" w:left="720" w:header="720" w:footer="720" w:gutter="0"/>
           <w:pgNumType w:start="1"/>
@@ -4582,10 +4622,10 @@
       </w:r>
     </w:p>
     <w:sectPr>
-      <w:headerReference w:type="even" r:id="rId21"/>
-      <w:headerReference w:type="default" r:id="rId22"/>
-      <w:footerReference w:type="default" r:id="rId23"/>
-      <w:headerReference w:type="first" r:id="rId24"/>
+      <w:headerReference w:type="even" r:id="rId20"/>
+      <w:headerReference w:type="default" r:id="rId21"/>
+      <w:footerReference w:type="default" r:id="rId22"/>
+      <w:headerReference w:type="first" r:id="rId23"/>
       <w:pgSz w:w="12240" w:h="15840"/>
       <w:pgMar w:top="720" w:right="720" w:bottom="720" w:left="720" w:header="720" w:footer="720" w:gutter="0"/>
       <w:cols w:space="720"/>
@@ -7192,6 +7232,14 @@
 </w:numbering>
 </file>
 
+<file path=word/people.xml><?xml version="1.0" encoding="utf-8"?>
+<w15:people xmlns:wpc="http://schemas.microsoft.com/office/word/2010/wordprocessingCanvas" xmlns:cx="http://schemas.microsoft.com/office/drawing/2014/chartex" xmlns:cx1="http://schemas.microsoft.com/office/drawing/2015/9/8/chartex" xmlns:cx2="http://schemas.microsoft.com/office/drawing/2015/10/21/chartex" xmlns:cx3="http://schemas.microsoft.com/office/drawing/2016/5/9/chartex" xmlns:cx4="http://schemas.microsoft.com/office/drawing/2016/5/10/chartex" xmlns:cx5="http://schemas.microsoft.com/office/drawing/2016/5/11/chartex" xmlns:cx6="http://schemas.microsoft.com/office/drawing/2016/5/12/chartex" xmlns:cx7="http://schemas.microsoft.com/office/drawing/2016/5/13/chartex" xmlns:cx8="http://schemas.microsoft.com/office/drawing/2016/5/14/chartex" xmlns:mc="http://schemas.openxmlformats.org/markup-compatibility/2006" xmlns:aink="http://schemas.microsoft.com/office/drawing/2016/ink" xmlns:am3d="http://schemas.microsoft.com/office/drawing/2017/model3d" xmlns:o="urn:schemas-microsoft-com:office:office" xmlns:oel="http://schemas.microsoft.com/office/2019/extlst" xmlns:r="http://schemas.openxmlformats.org/officeDocument/2006/relationships" xmlns:m="http://schemas.openxmlformats.org/officeDocument/2006/math" xmlns:v="urn:schemas-microsoft-com:vml" xmlns:wp14="http://schemas.microsoft.com/office/word/2010/wordprocessingDrawing" xmlns:wp="http://schemas.openxmlformats.org/drawingml/2006/wordprocessingDrawing" xmlns:w10="urn:schemas-microsoft-com:office:word" xmlns:w="http://schemas.openxmlformats.org/wordprocessingml/2006/main" xmlns:w14="http://schemas.microsoft.com/office/word/2010/wordml" xmlns:w15="http://schemas.microsoft.com/office/word/2012/wordml" xmlns:w16cex="http://schemas.microsoft.com/office/word/2018/wordml/cex" xmlns:w16cid="http://schemas.microsoft.com/office/word/2016/wordml/cid" xmlns:w16="http://schemas.microsoft.com/office/word/2018/wordml" xmlns:w16sdtdh="http://schemas.microsoft.com/office/word/2020/wordml/sdtdatahash" xmlns:w16se="http://schemas.microsoft.com/office/word/2015/wordml/symex" xmlns:wpg="http://schemas.microsoft.com/office/word/2010/wordprocessingGroup" xmlns:wpi="http://schemas.microsoft.com/office/word/2010/wordprocessingInk" xmlns:wne="http://schemas.microsoft.com/office/word/2006/wordml" xmlns:wps="http://schemas.microsoft.com/office/word/2010/wordprocessingShape" mc:Ignorable="w14 w15 w16se w16cid w16 w16cex w16sdtdh wp14">
+  <w15:person w15:author="Alhabibi, Haider@Energy">
+    <w15:presenceInfo w15:providerId="AD" w15:userId="S::Haider.AlHabibi@energy.ca.gov::9decb8d2-95ad-4b7d-9bf6-d4373f69254c"/>
+  </w15:person>
+</w15:people>
+</file>
+
 <file path=word/styles.xml><?xml version="1.0" encoding="utf-8"?>
 <w:styles xmlns:mc="http://schemas.openxmlformats.org/markup-compatibility/2006" xmlns:r="http://schemas.openxmlformats.org/officeDocument/2006/relationships" xmlns:w="http://schemas.openxmlformats.org/wordprocessingml/2006/main" xmlns:w14="http://schemas.microsoft.com/office/word/2010/wordml" xmlns:w15="http://schemas.microsoft.com/office/word/2012/wordml" xmlns:w16cex="http://schemas.microsoft.com/office/word/2018/wordml/cex" xmlns:w16cid="http://schemas.microsoft.com/office/word/2016/wordml/cid" xmlns:w16="http://schemas.microsoft.com/office/word/2018/wordml" xmlns:w16sdtdh="http://schemas.microsoft.com/office/word/2020/wordml/sdtdatahash" xmlns:w16se="http://schemas.microsoft.com/office/word/2015/wordml/symex" mc:Ignorable="w14 w15 w16se w16cid w16 w16cex w16sdtdh">
   <w:docDefaults>
@@ -7944,6 +7992,18 @@
       </w:tblBorders>
     </w:tblPr>
   </w:style>
+  <w:style w:type="character" w:styleId="UnresolvedMention">
+    <w:name w:val="Unresolved Mention"/>
+    <w:basedOn w:val="DefaultParagraphFont"/>
+    <w:uiPriority w:val="99"/>
+    <w:semiHidden/>
+    <w:unhideWhenUsed/>
+    <w:rsid w:val="00CB21E5"/>
+    <w:rPr>
+      <w:color w:val="605E5C"/>
+      <w:shd w:val="clear" w:color="auto" w:fill="E1DFDD"/>
+    </w:rPr>
+  </w:style>
 </w:styles>
 </file>
 
@@ -8254,14 +8314,15 @@
 </file>
 
 <file path=customXml/item2.xml><?xml version="1.0" encoding="utf-8"?>
-<b:Sources xmlns:b="http://schemas.openxmlformats.org/officeDocument/2006/bibliography" xmlns="http://schemas.openxmlformats.org/officeDocument/2006/bibliography" SelectedStyle="\APA.XSL" StyleName="APA Fifth Edition"/>
+<?mso-contentType ?>
+<FormTemplates xmlns="http://schemas.microsoft.com/sharepoint/v3/contenttype/forms">
+  <Display>DocumentLibraryForm</Display>
+  <Edit>DocumentLibraryForm</Edit>
+  <New>DocumentLibraryForm</New>
+</FormTemplates>
 </file>
 
 <file path=customXml/item3.xml><?xml version="1.0" encoding="utf-8"?>
-<b:Sources xmlns:b="http://schemas.openxmlformats.org/officeDocument/2006/bibliography" xmlns="http://schemas.openxmlformats.org/officeDocument/2006/bibliography" SelectedStyle="\APA.XSL" StyleName="APA Fifth Edition"/>
-</file>
-
-<file path=customXml/item4.xml><?xml version="1.0" encoding="utf-8"?>
 <ct:contentTypeSchema xmlns:ct="http://schemas.microsoft.com/office/2006/metadata/contentType" xmlns:ma="http://schemas.microsoft.com/office/2006/metadata/properties/metaAttributes" ct:_="" ma:_="" ma:contentTypeName="Document" ma:contentTypeID="0x01010061DC9A153AAEEE45BACE06E01F8272AC" ma:contentTypeVersion="20" ma:contentTypeDescription="Create a new document." ma:contentTypeScope="" ma:versionID="9666f44ab16ed15b00f463a1ceb948f7">
   <xsd:schema xmlns:xsd="http://www.w3.org/2001/XMLSchema" xmlns:xs="http://www.w3.org/2001/XMLSchema" xmlns:p="http://schemas.microsoft.com/office/2006/metadata/properties" xmlns:ns2="785685f2-c2e1-4352-89aa-3faca8eaba52" xmlns:ns3="5067c814-4b34-462c-a21d-c185ff6548d2" targetNamespace="http://schemas.microsoft.com/office/2006/metadata/properties" ma:root="true" ma:fieldsID="3613115c6c127afe4a56fd1236c892c2" ns2:_="" ns3:_="">
     <xsd:import namespace="785685f2-c2e1-4352-89aa-3faca8eaba52"/>
@@ -8544,49 +8605,40 @@
 </ct:contentTypeSchema>
 </file>
 
+<file path=customXml/item4.xml><?xml version="1.0" encoding="utf-8"?>
+<b:Sources xmlns:b="http://schemas.openxmlformats.org/officeDocument/2006/bibliography" xmlns="http://schemas.openxmlformats.org/officeDocument/2006/bibliography" SelectedStyle="\APA.XSL" StyleName="APA Fifth Edition"/>
+</file>
+
 <file path=customXml/item5.xml><?xml version="1.0" encoding="utf-8"?>
-<?mso-contentType ?>
-<FormTemplates xmlns="http://schemas.microsoft.com/sharepoint/v3/contenttype/forms">
-  <Display>DocumentLibraryForm</Display>
-  <Edit>DocumentLibraryForm</Edit>
-  <New>DocumentLibraryForm</New>
-</FormTemplates>
+<b:Sources xmlns:b="http://schemas.openxmlformats.org/officeDocument/2006/bibliography" xmlns="http://schemas.openxmlformats.org/officeDocument/2006/bibliography" SelectedStyle="\APA.XSL" StyleName="APA Fifth Edition"/>
 </file>
 
 <file path=customXml/itemProps1.xml><?xml version="1.0" encoding="utf-8"?>
 <ds:datastoreItem xmlns:ds="http://schemas.openxmlformats.org/officeDocument/2006/customXml" ds:itemID="{05A3B817-A36B-4556-9BF1-E99CE5E7CCD0}">
   <ds:schemaRefs>
+    <ds:schemaRef ds:uri="http://purl.org/dc/dcmitype/"/>
+    <ds:schemaRef ds:uri="http://schemas.microsoft.com/office/infopath/2007/PartnerControls"/>
     <ds:schemaRef ds:uri="http://purl.org/dc/elements/1.1/"/>
+    <ds:schemaRef ds:uri="http://purl.org/dc/terms/"/>
+    <ds:schemaRef ds:uri="http://schemas.openxmlformats.org/package/2006/metadata/core-properties"/>
+    <ds:schemaRef ds:uri="5067c814-4b34-462c-a21d-c185ff6548d2"/>
+    <ds:schemaRef ds:uri="http://schemas.microsoft.com/office/2006/documentManagement/types"/>
+    <ds:schemaRef ds:uri="http://www.w3.org/XML/1998/namespace"/>
+    <ds:schemaRef ds:uri="785685f2-c2e1-4352-89aa-3faca8eaba52"/>
     <ds:schemaRef ds:uri="http://schemas.microsoft.com/office/2006/metadata/properties"/>
-    <ds:schemaRef ds:uri="http://schemas.microsoft.com/office/infopath/2007/PartnerControls"/>
-    <ds:schemaRef ds:uri="http://purl.org/dc/terms/"/>
-    <ds:schemaRef ds:uri="http://schemas.microsoft.com/office/2006/documentManagement/types"/>
-    <ds:schemaRef ds:uri="http://purl.org/dc/dcmitype/"/>
-    <ds:schemaRef ds:uri="5067c814-4b34-462c-a21d-c185ff6548d2"/>
-    <ds:schemaRef ds:uri="http://schemas.openxmlformats.org/package/2006/metadata/core-properties"/>
-    <ds:schemaRef ds:uri="785685f2-c2e1-4352-89aa-3faca8eaba52"/>
-    <ds:schemaRef ds:uri="http://www.w3.org/XML/1998/namespace"/>
   </ds:schemaRefs>
 </ds:datastoreItem>
 </file>
 
 <file path=customXml/itemProps2.xml><?xml version="1.0" encoding="utf-8"?>
-<ds:datastoreItem xmlns:ds="http://schemas.openxmlformats.org/officeDocument/2006/customXml" ds:itemID="{E3A68A32-852C-433E-829D-FF0082D79AEA}">
+<ds:datastoreItem xmlns:ds="http://schemas.openxmlformats.org/officeDocument/2006/customXml" ds:itemID="{A894B69A-C6F3-4F96-A046-DC8F551A21FE}">
   <ds:schemaRefs>
-    <ds:schemaRef ds:uri="http://schemas.openxmlformats.org/officeDocument/2006/bibliography"/>
+    <ds:schemaRef ds:uri="http://schemas.microsoft.com/sharepoint/v3/contenttype/forms"/>
   </ds:schemaRefs>
 </ds:datastoreItem>
 </file>
 
 <file path=customXml/itemProps3.xml><?xml version="1.0" encoding="utf-8"?>
-<ds:datastoreItem xmlns:ds="http://schemas.openxmlformats.org/officeDocument/2006/customXml" ds:itemID="{8B68467C-C70C-4D09-B61E-25DFC690D6EB}">
-  <ds:schemaRefs>
-    <ds:schemaRef ds:uri="http://schemas.openxmlformats.org/officeDocument/2006/bibliography"/>
-  </ds:schemaRefs>
-</ds:datastoreItem>
-</file>
-
-<file path=customXml/itemProps4.xml><?xml version="1.0" encoding="utf-8"?>
 <ds:datastoreItem xmlns:ds="http://schemas.openxmlformats.org/officeDocument/2006/customXml" ds:itemID="{B22D1681-6FD6-40D6-BA77-5F4AC5A0095C}">
   <ds:schemaRefs>
     <ds:schemaRef ds:uri="http://schemas.microsoft.com/office/2006/metadata/contentType"/>
@@ -8605,10 +8657,18 @@
 </ds:datastoreItem>
 </file>
 
+<file path=customXml/itemProps4.xml><?xml version="1.0" encoding="utf-8"?>
+<ds:datastoreItem xmlns:ds="http://schemas.openxmlformats.org/officeDocument/2006/customXml" ds:itemID="{8B68467C-C70C-4D09-B61E-25DFC690D6EB}">
+  <ds:schemaRefs>
+    <ds:schemaRef ds:uri="http://schemas.openxmlformats.org/officeDocument/2006/bibliography"/>
+  </ds:schemaRefs>
+</ds:datastoreItem>
+</file>
+
 <file path=customXml/itemProps5.xml><?xml version="1.0" encoding="utf-8"?>
-<ds:datastoreItem xmlns:ds="http://schemas.openxmlformats.org/officeDocument/2006/customXml" ds:itemID="{A894B69A-C6F3-4F96-A046-DC8F551A21FE}">
+<ds:datastoreItem xmlns:ds="http://schemas.openxmlformats.org/officeDocument/2006/customXml" ds:itemID="{E3A68A32-852C-433E-829D-FF0082D79AEA}">
   <ds:schemaRefs>
-    <ds:schemaRef ds:uri="http://schemas.microsoft.com/sharepoint/v3/contenttype/forms"/>
+    <ds:schemaRef ds:uri="http://schemas.openxmlformats.org/officeDocument/2006/bibliography"/>
   </ds:schemaRefs>
 </ds:datastoreItem>
 </file>
</xml_diff>